<commit_message>
Fuel: reviewer name, lock edit, manual update
Co-Authored-By: Claude Opus 5.5 (1M context) <noreply@anthropic.com>
Claude-Session: https://claude.ai/code/session_01A6eSje5u6Dt5wWDhzRa4mg
</commit_message>
<xml_diff>
--- a/web/manual/fuel-app-manual-km.docx
+++ b/web/manual/fuel-app-manual-km.docx
@@ -1148,7 +1148,7 @@
     </w:p>
     <w:bookmarkEnd w:id="38"/>
     <w:bookmarkEnd w:id="39"/>
-    <w:bookmarkStart w:id="80" w:name="ចកសងថម-ជហនមតងមយ"/>
+    <w:bookmarkStart w:id="86" w:name="ចកសងថម-ជហនមតងមយ"/>
     <w:p>
       <w:pPr>
         <w:pStyle w:val="Heading1"/>
@@ -1382,7 +1382,7 @@
       </w:r>
     </w:p>
     <w:bookmarkEnd w:id="43"/>
-    <w:bookmarkStart w:id="50" w:name="ជហន-២-ជរសរសផលកលខ-នងតកង"/>
+    <w:bookmarkStart w:id="56" w:name="ជហន-២-ជរសរសផលកលខ-នងតកង"/>
     <w:p>
       <w:pPr>
         <w:pStyle w:val="Heading2"/>
@@ -1512,6 +1512,12 @@
         <w:pStyle w:val="Compact"/>
       </w:pPr>
       <w:r>
+        <w:t xml:space="preserve">ប្រអប់</w:t>
+      </w:r>
+      <w:r>
+        <w:t xml:space="preserve"> </w:t>
+      </w:r>
+      <w:r>
         <w:rPr>
           <w:bCs/>
           <w:b/>
@@ -1522,7 +1528,7 @@
         <w:t xml:space="preserve"> </w:t>
       </w:r>
       <w:r>
-        <w:t xml:space="preserve">ចេញឯងៗ។ បើមិនត្រូវ ចុចប្រអប់</w:t>
+        <w:t xml:space="preserve">នៅទទេ។ ចុចប្រអប់</w:t>
       </w:r>
       <w:r>
         <w:t xml:space="preserve"> </w:t>
@@ -1535,10 +1541,7 @@
         <w:t xml:space="preserve">ឈ្មោះតៃកុង</w:t>
       </w:r>
       <w:r>
-        <w:t xml:space="preserve"> </w:t>
-      </w:r>
-      <w:r>
-        <w:t xml:space="preserve">ហើយជ្រើសរើសឈ្មោះត្រឹមត្រូវ។</w:t>
+        <w:t xml:space="preserve">។</w:t>
       </w:r>
     </w:p>
     <w:p>
@@ -1548,7 +1551,7 @@
       <w:r>
         <w:drawing>
           <wp:inline>
-            <wp:extent cx="2879999" cy="1646399"/>
+            <wp:extent cx="2879999" cy="1649162"/>
             <wp:effectExtent b="0" l="0" r="0" t="0"/>
             <wp:docPr descr="" title="" id="48" name="Picture"/>
             <a:graphic>
@@ -1569,7 +1572,7 @@
                   <pic:spPr bwMode="auto">
                     <a:xfrm>
                       <a:off x="0" y="0"/>
-                      <a:ext cx="2879999" cy="1646399"/>
+                      <a:ext cx="2879999" cy="1649162"/>
                     </a:xfrm>
                     <a:prstGeom prst="rect">
                       <a:avLst/>
@@ -1590,61 +1593,6 @@
     </w:p>
     <w:p>
       <w:pPr>
-        <w:pStyle w:val="BlockText"/>
-      </w:pPr>
-      <w:r>
-        <w:t xml:space="preserve">រកមិនឃើញឡាន ឬឈ្មោះ? ចុច</w:t>
-      </w:r>
-      <w:r>
-        <w:t xml:space="preserve"> </w:t>
-      </w:r>
-      <w:r>
-        <w:rPr>
-          <w:bCs/>
-          <w:b/>
-        </w:rPr>
-        <w:t xml:space="preserve">➕ បន្ថែមឡានថ្មី</w:t>
-      </w:r>
-      <w:r>
-        <w:t xml:space="preserve"> </w:t>
-      </w:r>
-      <w:r>
-        <w:t xml:space="preserve">ឬ</w:t>
-      </w:r>
-      <w:r>
-        <w:t xml:space="preserve"> </w:t>
-      </w:r>
-      <w:r>
-        <w:rPr>
-          <w:bCs/>
-          <w:b/>
-        </w:rPr>
-        <w:t xml:space="preserve">➕ បន្ថែមតៃកុងថ្មី</w:t>
-      </w:r>
-      <w:r>
-        <w:t xml:space="preserve">។</w:t>
-      </w:r>
-    </w:p>
-    <w:p>
-      <w:pPr>
-        <w:pStyle w:val="BlockText"/>
-      </w:pPr>
-      <w:r>
-        <w:t xml:space="preserve">ងាយជាងនេះ៖ ស្កេន QR លើឡាន (មើលផ្នែកទី ៤)។</w:t>
-      </w:r>
-    </w:p>
-    <w:bookmarkEnd w:id="50"/>
-    <w:bookmarkStart w:id="57" w:name="ជហន-៣-ថតរបកងទរឡន-នងវយ-km"/>
-    <w:p>
-      <w:pPr>
-        <w:pStyle w:val="Heading2"/>
-      </w:pPr>
-      <w:r>
-        <w:t xml:space="preserve">ជំហាន ៣៖ ថតរូបកុងទ័រឡាន និងវាយ Km</w:t>
-      </w:r>
-    </w:p>
-    <w:p>
-      <w:pPr>
         <w:numPr>
           <w:ilvl w:val="0"/>
           <w:numId w:val="1011"/>
@@ -1652,64 +1600,20 @@
         <w:pStyle w:val="Compact"/>
       </w:pPr>
       <w:r>
-        <w:t xml:space="preserve">ចុច</w:t>
-      </w:r>
-      <w:r>
-        <w:t xml:space="preserve"> </w:t>
-      </w:r>
-      <w:r>
-        <w:rPr>
-          <w:bCs/>
-          <w:b/>
-        </w:rPr>
-        <w:t xml:space="preserve">📷 រូបថតកុងទ័រឡាន</w:t>
-      </w:r>
-      <w:r>
-        <w:t xml:space="preserve">។</w:t>
-      </w:r>
-    </w:p>
-    <w:p>
-      <w:pPr>
-        <w:numPr>
-          <w:ilvl w:val="0"/>
-          <w:numId w:val="1011"/>
-        </w:numPr>
-        <w:pStyle w:val="Compact"/>
-      </w:pPr>
-      <w:r>
-        <w:t xml:space="preserve">ចុច</w:t>
-      </w:r>
-      <w:r>
-        <w:t xml:space="preserve"> </w:t>
-      </w:r>
-      <w:r>
-        <w:rPr>
-          <w:bCs/>
-          <w:b/>
-        </w:rPr>
-        <w:t xml:space="preserve">ថតរូប</w:t>
-      </w:r>
-      <w:r>
-        <w:t xml:space="preserve"> </w:t>
-      </w:r>
-      <w:r>
-        <w:t xml:space="preserve">(ថតឥឡូវ) ឬ</w:t>
-      </w:r>
-      <w:r>
-        <w:t xml:space="preserve"> </w:t>
-      </w:r>
-      <w:r>
-        <w:rPr>
-          <w:bCs/>
-          <w:b/>
-        </w:rPr>
-        <w:t xml:space="preserve">ជ្រើសរើសពីរូបភាព</w:t>
-      </w:r>
-      <w:r>
-        <w:t xml:space="preserve"> </w:t>
-      </w:r>
-      <w:r>
-        <w:t xml:space="preserve">(រូបដែលថតរួច)។</w:t>
+        <w:t xml:space="preserve">វាយផ្នែកនៃឈ្មោះរបស់អ្នក ហើយចុចលើ</w:t>
+      </w:r>
+      <w:r>
+        <w:t xml:space="preserve"> </w:t>
+      </w:r>
+      <w:r>
+        <w:rPr>
+          <w:bCs/>
+          <w:b/>
+        </w:rPr>
+        <w:t xml:space="preserve">ឈ្មោះរបស់អ្នក</w:t>
+      </w:r>
+      <w:r>
+        <w:t xml:space="preserve">។ តៃកុងដែលធ្លាប់បើកឡាននេះ នៅខាងលើគេ។</w:t>
       </w:r>
     </w:p>
     <w:p>
@@ -1719,20 +1623,238 @@
       <w:r>
         <w:drawing>
           <wp:inline>
-            <wp:extent cx="2159999" cy="4672799"/>
+            <wp:extent cx="2159999" cy="4674461"/>
             <wp:effectExtent b="0" l="0" r="0" t="0"/>
-            <wp:docPr descr="" title="" id="52" name="Picture"/>
+            <wp:docPr descr="" title="" id="51" name="Picture"/>
             <a:graphic>
               <a:graphicData uri="http://schemas.openxmlformats.org/drawingml/2006/picture">
                 <pic:pic>
                   <pic:nvPicPr>
-                    <pic:cNvPr descr="up/f05-photo-sheet.png" id="53" name="Picture"/>
+                    <pic:cNvPr descr="up/f04b-driver-pick.png" id="52" name="Picture"/>
                     <pic:cNvPicPr>
                       <a:picLocks noChangeArrowheads="1" noChangeAspect="1"/>
                     </pic:cNvPicPr>
                   </pic:nvPicPr>
                   <pic:blipFill>
-                    <a:blip r:embed="rId51"/>
+                    <a:blip r:embed="rId50"/>
+                    <a:stretch>
+                      <a:fillRect/>
+                    </a:stretch>
+                  </pic:blipFill>
+                  <pic:spPr bwMode="auto">
+                    <a:xfrm>
+                      <a:off x="0" y="0"/>
+                      <a:ext cx="2159999" cy="4674461"/>
+                    </a:xfrm>
+                    <a:prstGeom prst="rect">
+                      <a:avLst/>
+                    </a:prstGeom>
+                    <a:noFill/>
+                    <a:ln w="9525">
+                      <a:noFill/>
+                      <a:headEnd/>
+                      <a:tailEnd/>
+                    </a:ln>
+                  </pic:spPr>
+                </pic:pic>
+              </a:graphicData>
+            </a:graphic>
+          </wp:inline>
+        </w:drawing>
+      </w:r>
+    </w:p>
+    <w:p>
+      <w:pPr>
+        <w:pStyle w:val="BodyText"/>
+      </w:pPr>
+      <w:r>
+        <w:drawing>
+          <wp:inline>
+            <wp:extent cx="2879999" cy="1649162"/>
+            <wp:effectExtent b="0" l="0" r="0" t="0"/>
+            <wp:docPr descr="" title="" id="54" name="Picture"/>
+            <a:graphic>
+              <a:graphicData uri="http://schemas.openxmlformats.org/drawingml/2006/picture">
+                <pic:pic>
+                  <pic:nvPicPr>
+                    <pic:cNvPr descr="up/f04c-plate-driver-done.png" id="55" name="Picture"/>
+                    <pic:cNvPicPr>
+                      <a:picLocks noChangeArrowheads="1" noChangeAspect="1"/>
+                    </pic:cNvPicPr>
+                  </pic:nvPicPr>
+                  <pic:blipFill>
+                    <a:blip r:embed="rId53"/>
+                    <a:stretch>
+                      <a:fillRect/>
+                    </a:stretch>
+                  </pic:blipFill>
+                  <pic:spPr bwMode="auto">
+                    <a:xfrm>
+                      <a:off x="0" y="0"/>
+                      <a:ext cx="2879999" cy="1649162"/>
+                    </a:xfrm>
+                    <a:prstGeom prst="rect">
+                      <a:avLst/>
+                    </a:prstGeom>
+                    <a:noFill/>
+                    <a:ln w="9525">
+                      <a:noFill/>
+                      <a:headEnd/>
+                      <a:tailEnd/>
+                    </a:ln>
+                  </pic:spPr>
+                </pic:pic>
+              </a:graphicData>
+            </a:graphic>
+          </wp:inline>
+        </w:drawing>
+      </w:r>
+    </w:p>
+    <w:p>
+      <w:pPr>
+        <w:pStyle w:val="BlockText"/>
+      </w:pPr>
+      <w:r>
+        <w:t xml:space="preserve">រកមិនឃើញឡាន ឬឈ្មោះ? ចុច</w:t>
+      </w:r>
+      <w:r>
+        <w:t xml:space="preserve"> </w:t>
+      </w:r>
+      <w:r>
+        <w:rPr>
+          <w:bCs/>
+          <w:b/>
+        </w:rPr>
+        <w:t xml:space="preserve">➕ បន្ថែមឡានថ្មី</w:t>
+      </w:r>
+      <w:r>
+        <w:t xml:space="preserve"> </w:t>
+      </w:r>
+      <w:r>
+        <w:t xml:space="preserve">ឬ</w:t>
+      </w:r>
+      <w:r>
+        <w:t xml:space="preserve"> </w:t>
+      </w:r>
+      <w:r>
+        <w:rPr>
+          <w:bCs/>
+          <w:b/>
+        </w:rPr>
+        <w:t xml:space="preserve">➕ បន្ថែមតៃកុងថ្មី</w:t>
+      </w:r>
+      <w:r>
+        <w:t xml:space="preserve">។</w:t>
+      </w:r>
+    </w:p>
+    <w:p>
+      <w:pPr>
+        <w:pStyle w:val="BlockText"/>
+      </w:pPr>
+      <w:r>
+        <w:t xml:space="preserve">ងាយជាងនេះ៖ ស្កេន QR លើឡាន (មើលផ្នែកទី ៤)។</w:t>
+      </w:r>
+    </w:p>
+    <w:bookmarkEnd w:id="56"/>
+    <w:bookmarkStart w:id="63" w:name="ជហន-៣-ថតរបកងទរឡន-នងវយ-km"/>
+    <w:p>
+      <w:pPr>
+        <w:pStyle w:val="Heading2"/>
+      </w:pPr>
+      <w:r>
+        <w:t xml:space="preserve">ជំហាន ៣៖ ថតរូបកុងទ័រឡាន និងវាយ Km</w:t>
+      </w:r>
+    </w:p>
+    <w:p>
+      <w:pPr>
+        <w:numPr>
+          <w:ilvl w:val="0"/>
+          <w:numId w:val="1012"/>
+        </w:numPr>
+        <w:pStyle w:val="Compact"/>
+      </w:pPr>
+      <w:r>
+        <w:t xml:space="preserve">ចុច</w:t>
+      </w:r>
+      <w:r>
+        <w:t xml:space="preserve"> </w:t>
+      </w:r>
+      <w:r>
+        <w:rPr>
+          <w:bCs/>
+          <w:b/>
+        </w:rPr>
+        <w:t xml:space="preserve">📷 រូបថតកុងទ័រឡាន</w:t>
+      </w:r>
+      <w:r>
+        <w:t xml:space="preserve">។</w:t>
+      </w:r>
+    </w:p>
+    <w:p>
+      <w:pPr>
+        <w:numPr>
+          <w:ilvl w:val="0"/>
+          <w:numId w:val="1012"/>
+        </w:numPr>
+        <w:pStyle w:val="Compact"/>
+      </w:pPr>
+      <w:r>
+        <w:t xml:space="preserve">ចុច</w:t>
+      </w:r>
+      <w:r>
+        <w:t xml:space="preserve"> </w:t>
+      </w:r>
+      <w:r>
+        <w:rPr>
+          <w:bCs/>
+          <w:b/>
+        </w:rPr>
+        <w:t xml:space="preserve">ថតរូប</w:t>
+      </w:r>
+      <w:r>
+        <w:t xml:space="preserve"> </w:t>
+      </w:r>
+      <w:r>
+        <w:t xml:space="preserve">(ថតឥឡូវ) ឬ</w:t>
+      </w:r>
+      <w:r>
+        <w:t xml:space="preserve"> </w:t>
+      </w:r>
+      <w:r>
+        <w:rPr>
+          <w:bCs/>
+          <w:b/>
+        </w:rPr>
+        <w:t xml:space="preserve">ជ្រើសរើសពីរូបភាព</w:t>
+      </w:r>
+      <w:r>
+        <w:t xml:space="preserve"> </w:t>
+      </w:r>
+      <w:r>
+        <w:t xml:space="preserve">(រូបដែលថតរួច)។</w:t>
+      </w:r>
+    </w:p>
+    <w:p>
+      <w:pPr>
+        <w:pStyle w:val="FirstParagraph"/>
+      </w:pPr>
+      <w:r>
+        <w:drawing>
+          <wp:inline>
+            <wp:extent cx="2159999" cy="4672799"/>
+            <wp:effectExtent b="0" l="0" r="0" t="0"/>
+            <wp:docPr descr="" title="" id="58" name="Picture"/>
+            <a:graphic>
+              <a:graphicData uri="http://schemas.openxmlformats.org/drawingml/2006/picture">
+                <pic:pic>
+                  <pic:nvPicPr>
+                    <pic:cNvPr descr="up/f05-photo-sheet.png" id="59" name="Picture"/>
+                    <pic:cNvPicPr>
+                      <a:picLocks noChangeArrowheads="1" noChangeAspect="1"/>
+                    </pic:cNvPicPr>
+                  </pic:nvPicPr>
+                  <pic:blipFill>
+                    <a:blip r:embed="rId57"/>
                     <a:stretch>
                       <a:fillRect/>
                     </a:stretch>
@@ -1763,7 +1885,7 @@
       <w:pPr>
         <w:numPr>
           <w:ilvl w:val="0"/>
-          <w:numId w:val="1012"/>
+          <w:numId w:val="1013"/>
         </w:numPr>
         <w:pStyle w:val="Compact"/>
       </w:pPr>
@@ -1809,18 +1931,18 @@
           <wp:inline>
             <wp:extent cx="2879999" cy="1929599"/>
             <wp:effectExtent b="0" l="0" r="0" t="0"/>
-            <wp:docPr descr="" title="" id="55" name="Picture"/>
+            <wp:docPr descr="" title="" id="61" name="Picture"/>
             <a:graphic>
               <a:graphicData uri="http://schemas.openxmlformats.org/drawingml/2006/picture">
                 <pic:pic>
                   <pic:nvPicPr>
-                    <pic:cNvPr descr="up/f06-odo.png" id="56" name="Picture"/>
+                    <pic:cNvPr descr="up/f06-odo.png" id="62" name="Picture"/>
                     <pic:cNvPicPr>
                       <a:picLocks noChangeArrowheads="1" noChangeAspect="1"/>
                     </pic:cNvPicPr>
                   </pic:nvPicPr>
                   <pic:blipFill>
-                    <a:blip r:embed="rId54"/>
+                    <a:blip r:embed="rId60"/>
                     <a:stretch>
                       <a:fillRect/>
                     </a:stretch>
@@ -1905,8 +2027,8 @@
         <w:t xml:space="preserve">តែពេលកុងទ័រខូចពិតប្រាកដ។ ពេលធីក មិនបាច់វាយ Km ទេ។</w:t>
       </w:r>
     </w:p>
-    <w:bookmarkEnd w:id="57"/>
-    <w:bookmarkStart w:id="61" w:name="ជហន-៤-ថតរបកងទរសង-នងវយលតរ"/>
+    <w:bookmarkEnd w:id="63"/>
+    <w:bookmarkStart w:id="67" w:name="ជហន-៤-ថតរបកងទរសង-នងវយលតរ"/>
     <w:p>
       <w:pPr>
         <w:pStyle w:val="Heading2"/>
@@ -1919,7 +2041,7 @@
       <w:pPr>
         <w:numPr>
           <w:ilvl w:val="0"/>
-          <w:numId w:val="1013"/>
+          <w:numId w:val="1014"/>
         </w:numPr>
         <w:pStyle w:val="Compact"/>
       </w:pPr>
@@ -1947,7 +2069,7 @@
       <w:pPr>
         <w:numPr>
           <w:ilvl w:val="0"/>
-          <w:numId w:val="1013"/>
+          <w:numId w:val="1014"/>
         </w:numPr>
         <w:pStyle w:val="Compact"/>
       </w:pPr>
@@ -1980,18 +2102,18 @@
           <wp:inline>
             <wp:extent cx="2879999" cy="1737599"/>
             <wp:effectExtent b="0" l="0" r="0" t="0"/>
-            <wp:docPr descr="" title="" id="59" name="Picture"/>
+            <wp:docPr descr="" title="" id="65" name="Picture"/>
             <a:graphic>
               <a:graphicData uri="http://schemas.openxmlformats.org/drawingml/2006/picture">
                 <pic:pic>
                   <pic:nvPicPr>
-                    <pic:cNvPr descr="up/f07-pump.png" id="60" name="Picture"/>
+                    <pic:cNvPr descr="up/f07-pump.png" id="66" name="Picture"/>
                     <pic:cNvPicPr>
                       <a:picLocks noChangeArrowheads="1" noChangeAspect="1"/>
                     </pic:cNvPicPr>
                   </pic:nvPicPr>
                   <pic:blipFill>
-                    <a:blip r:embed="rId58"/>
+                    <a:blip r:embed="rId64"/>
                     <a:stretch>
                       <a:fillRect/>
                     </a:stretch>
@@ -2018,8 +2140,8 @@
         </w:drawing>
       </w:r>
     </w:p>
-    <w:bookmarkEnd w:id="61"/>
-    <w:bookmarkStart w:id="68" w:name="ជហន-៥-សគល-នងទតង"/>
+    <w:bookmarkEnd w:id="67"/>
+    <w:bookmarkStart w:id="74" w:name="ជហន-៥-សគល-នងទតង"/>
     <w:p>
       <w:pPr>
         <w:pStyle w:val="Heading2"/>
@@ -2032,7 +2154,7 @@
       <w:pPr>
         <w:numPr>
           <w:ilvl w:val="0"/>
-          <w:numId w:val="1014"/>
+          <w:numId w:val="1015"/>
         </w:numPr>
         <w:pStyle w:val="Compact"/>
       </w:pPr>
@@ -2054,7 +2176,7 @@
       <w:pPr>
         <w:numPr>
           <w:ilvl w:val="0"/>
-          <w:numId w:val="1014"/>
+          <w:numId w:val="1015"/>
         </w:numPr>
         <w:pStyle w:val="Compact"/>
       </w:pPr>
@@ -2087,18 +2209,18 @@
           <wp:inline>
             <wp:extent cx="2879999" cy="1636799"/>
             <wp:effectExtent b="0" l="0" r="0" t="0"/>
-            <wp:docPr descr="" title="" id="63" name="Picture"/>
+            <wp:docPr descr="" title="" id="69" name="Picture"/>
             <a:graphic>
               <a:graphicData uri="http://schemas.openxmlformats.org/drawingml/2006/picture">
                 <pic:pic>
                   <pic:nvPicPr>
-                    <pic:cNvPr descr="up/f08-note-gps.png" id="64" name="Picture"/>
+                    <pic:cNvPr descr="up/f08-note-gps.png" id="70" name="Picture"/>
                     <pic:cNvPicPr>
                       <a:picLocks noChangeArrowheads="1" noChangeAspect="1"/>
                     </pic:cNvPicPr>
                   </pic:nvPicPr>
                   <pic:blipFill>
-                    <a:blip r:embed="rId62"/>
+                    <a:blip r:embed="rId68"/>
                     <a:stretch>
                       <a:fillRect/>
                     </a:stretch>
@@ -2174,18 +2296,18 @@
           <wp:inline>
             <wp:extent cx="2879999" cy="2385599"/>
             <wp:effectExtent b="0" l="0" r="0" t="0"/>
-            <wp:docPr descr="" title="" id="66" name="Picture"/>
+            <wp:docPr descr="" title="" id="72" name="Picture"/>
             <a:graphic>
               <a:graphicData uri="http://schemas.openxmlformats.org/drawingml/2006/picture">
                 <pic:pic>
                   <pic:nvPicPr>
-                    <pic:cNvPr descr="up/f13-warning.png" id="67" name="Picture"/>
+                    <pic:cNvPr descr="up/f13-warning.png" id="73" name="Picture"/>
                     <pic:cNvPicPr>
                       <a:picLocks noChangeArrowheads="1" noChangeAspect="1"/>
                     </pic:cNvPicPr>
                   </pic:nvPicPr>
                   <pic:blipFill>
-                    <a:blip r:embed="rId65"/>
+                    <a:blip r:embed="rId71"/>
                     <a:stretch>
                       <a:fillRect/>
                     </a:stretch>
@@ -2212,8 +2334,8 @@
         </w:drawing>
       </w:r>
     </w:p>
-    <w:bookmarkEnd w:id="68"/>
-    <w:bookmarkStart w:id="78" w:name="ជហន-៦-បញជន"/>
+    <w:bookmarkEnd w:id="74"/>
+    <w:bookmarkStart w:id="84" w:name="ជហន-៦-បញជន"/>
     <w:p>
       <w:pPr>
         <w:pStyle w:val="Heading2"/>
@@ -2226,7 +2348,7 @@
       <w:pPr>
         <w:numPr>
           <w:ilvl w:val="0"/>
-          <w:numId w:val="1015"/>
+          <w:numId w:val="1016"/>
         </w:numPr>
         <w:pStyle w:val="Compact"/>
       </w:pPr>
@@ -2256,18 +2378,18 @@
           <wp:inline>
             <wp:extent cx="2159999" cy="4672799"/>
             <wp:effectExtent b="0" l="0" r="0" t="0"/>
-            <wp:docPr descr="" title="" id="70" name="Picture"/>
+            <wp:docPr descr="" title="" id="76" name="Picture"/>
             <a:graphic>
               <a:graphicData uri="http://schemas.openxmlformats.org/drawingml/2006/picture">
                 <pic:pic>
                   <pic:nvPicPr>
-                    <pic:cNvPr descr="up/f09-submit.png" id="71" name="Picture"/>
+                    <pic:cNvPr descr="up/f09-submit.png" id="77" name="Picture"/>
                     <pic:cNvPicPr>
                       <a:picLocks noChangeArrowheads="1" noChangeAspect="1"/>
                     </pic:cNvPicPr>
                   </pic:nvPicPr>
                   <pic:blipFill>
-                    <a:blip r:embed="rId69"/>
+                    <a:blip r:embed="rId75"/>
                     <a:stretch>
                       <a:fillRect/>
                     </a:stretch>
@@ -2298,7 +2420,7 @@
       <w:pPr>
         <w:numPr>
           <w:ilvl w:val="0"/>
-          <w:numId w:val="1016"/>
+          <w:numId w:val="1017"/>
         </w:numPr>
         <w:pStyle w:val="Compact"/>
       </w:pPr>
@@ -2326,7 +2448,7 @@
       <w:pPr>
         <w:numPr>
           <w:ilvl w:val="0"/>
-          <w:numId w:val="1016"/>
+          <w:numId w:val="1017"/>
         </w:numPr>
         <w:pStyle w:val="Compact"/>
       </w:pPr>
@@ -2356,18 +2478,18 @@
           <wp:inline>
             <wp:extent cx="2879999" cy="2284799"/>
             <wp:effectExtent b="0" l="0" r="0" t="0"/>
-            <wp:docPr descr="" title="" id="73" name="Picture"/>
+            <wp:docPr descr="" title="" id="79" name="Picture"/>
             <a:graphic>
               <a:graphicData uri="http://schemas.openxmlformats.org/drawingml/2006/picture">
                 <pic:pic>
                   <pic:nvPicPr>
-                    <pic:cNvPr descr="up/f12-success.png" id="74" name="Picture"/>
+                    <pic:cNvPr descr="up/f12-success.png" id="80" name="Picture"/>
                     <pic:cNvPicPr>
                       <a:picLocks noChangeArrowheads="1" noChangeAspect="1"/>
                     </pic:cNvPicPr>
                   </pic:nvPicPr>
                   <pic:blipFill>
-                    <a:blip r:embed="rId72"/>
+                    <a:blip r:embed="rId78"/>
                     <a:stretch>
                       <a:fillRect/>
                     </a:stretch>
@@ -2443,18 +2565,18 @@
           <wp:inline>
             <wp:extent cx="2879999" cy="1339199"/>
             <wp:effectExtent b="0" l="0" r="0" t="0"/>
-            <wp:docPr descr="" title="" id="76" name="Picture"/>
+            <wp:docPr descr="" title="" id="82" name="Picture"/>
             <a:graphic>
               <a:graphicData uri="http://schemas.openxmlformats.org/drawingml/2006/picture">
                 <pic:pic>
                   <pic:nvPicPr>
-                    <pic:cNvPr descr="up/f10-errors.png" id="77" name="Picture"/>
+                    <pic:cNvPr descr="up/f10-errors.png" id="83" name="Picture"/>
                     <pic:cNvPicPr>
                       <a:picLocks noChangeArrowheads="1" noChangeAspect="1"/>
                     </pic:cNvPicPr>
                   </pic:nvPicPr>
                   <pic:blipFill>
-                    <a:blip r:embed="rId75"/>
+                    <a:blip r:embed="rId81"/>
                     <a:stretch>
                       <a:fillRect/>
                     </a:stretch>
@@ -2481,8 +2603,8 @@
         </w:drawing>
       </w:r>
     </w:p>
-    <w:bookmarkEnd w:id="78"/>
-    <w:bookmarkStart w:id="79" w:name="អឡវទរ-នងមសនភលង"/>
+    <w:bookmarkEnd w:id="84"/>
+    <w:bookmarkStart w:id="85" w:name="អឡវទរ-នងមសនភលង"/>
     <w:p>
       <w:pPr>
         <w:pStyle w:val="Heading2"/>
@@ -2503,7 +2625,7 @@
       <w:pPr>
         <w:numPr>
           <w:ilvl w:val="0"/>
-          <w:numId w:val="1017"/>
+          <w:numId w:val="1018"/>
         </w:numPr>
         <w:pStyle w:val="Compact"/>
       </w:pPr>
@@ -2531,7 +2653,7 @@
       <w:pPr>
         <w:numPr>
           <w:ilvl w:val="0"/>
-          <w:numId w:val="1017"/>
+          <w:numId w:val="1018"/>
         </w:numPr>
         <w:pStyle w:val="Compact"/>
       </w:pPr>
@@ -2555,9 +2677,9 @@
         <w:t xml:space="preserve">ហើយវាយលេខម៉ោង ជំនួស Km។</w:t>
       </w:r>
     </w:p>
-    <w:bookmarkEnd w:id="79"/>
-    <w:bookmarkEnd w:id="80"/>
-    <w:bookmarkStart w:id="87" w:name="សកន-qr-លឡន"/>
+    <w:bookmarkEnd w:id="85"/>
+    <w:bookmarkEnd w:id="86"/>
+    <w:bookmarkStart w:id="93" w:name="សកន-qr-លឡន"/>
     <w:p>
       <w:pPr>
         <w:pStyle w:val="Heading1"/>
@@ -2587,7 +2709,7 @@
         <w:t xml:space="preserve"> </w:t>
       </w:r>
       <w:r>
-        <w:t xml:space="preserve">ដូចរូបខាងក្រោម។ ស្កេនវា ផ្លាកលេខ និងឈ្មោះតៃកុង នឹងបំពេញដោយខ្លួនឯង។</w:t>
+        <w:t xml:space="preserve">ដូចរូបខាងក្រោម។ ស្កេនវា ផ្លាកលេខ នឹងបំពេញដោយខ្លួនឯង។</w:t>
       </w:r>
     </w:p>
     <w:p>
@@ -2599,18 +2721,18 @@
           <wp:inline>
             <wp:extent cx="2519999" cy="1919399"/>
             <wp:effectExtent b="0" l="0" r="0" t="0"/>
-            <wp:docPr descr="" title="" id="82" name="Picture"/>
+            <wp:docPr descr="" title="" id="88" name="Picture"/>
             <a:graphic>
               <a:graphicData uri="http://schemas.openxmlformats.org/drawingml/2006/picture">
                 <pic:pic>
                   <pic:nvPicPr>
-                    <pic:cNvPr descr="up/f17-sticker.png" id="83" name="Picture"/>
+                    <pic:cNvPr descr="up/f17-sticker.png" id="89" name="Picture"/>
                     <pic:cNvPicPr>
                       <a:picLocks noChangeArrowheads="1" noChangeAspect="1"/>
                     </pic:cNvPicPr>
                   </pic:nvPicPr>
                   <pic:blipFill>
-                    <a:blip r:embed="rId81"/>
+                    <a:blip r:embed="rId87"/>
                     <a:stretch>
                       <a:fillRect/>
                     </a:stretch>
@@ -2641,7 +2763,7 @@
       <w:pPr>
         <w:numPr>
           <w:ilvl w:val="0"/>
-          <w:numId w:val="1018"/>
+          <w:numId w:val="1019"/>
         </w:numPr>
         <w:pStyle w:val="Compact"/>
       </w:pPr>
@@ -2682,7 +2804,7 @@
       <w:pPr>
         <w:numPr>
           <w:ilvl w:val="0"/>
-          <w:numId w:val="1018"/>
+          <w:numId w:val="1019"/>
         </w:numPr>
         <w:pStyle w:val="Compact"/>
       </w:pPr>
@@ -2725,7 +2847,7 @@
       <w:pPr>
         <w:numPr>
           <w:ilvl w:val="0"/>
-          <w:numId w:val="1018"/>
+          <w:numId w:val="1019"/>
         </w:numPr>
         <w:pStyle w:val="Compact"/>
       </w:pPr>
@@ -2753,19 +2875,60 @@
       <w:pPr>
         <w:numPr>
           <w:ilvl w:val="0"/>
-          <w:numId w:val="1018"/>
+          <w:numId w:val="1019"/>
         </w:numPr>
         <w:pStyle w:val="Compact"/>
       </w:pPr>
       <w:r>
-        <w:t xml:space="preserve">ពេលស្កេនបាន ផ្ទាំងបិទដោយខ្លួនឯង ហើយឃើញផ្លាកលេខ និងតៃកុងរួចហើយ។</w:t>
+        <w:t xml:space="preserve">ពេលស្កេនបាន ផ្ទាំងបិទដោយខ្លួនឯង ហើយឃើញផ្លាកលេខរួចហើយ។</w:t>
       </w:r>
     </w:p>
     <w:p>
       <w:pPr>
         <w:numPr>
           <w:ilvl w:val="0"/>
-          <w:numId w:val="1018"/>
+          <w:numId w:val="1019"/>
+        </w:numPr>
+        <w:pStyle w:val="Compact"/>
+      </w:pPr>
+      <w:r>
+        <w:t xml:space="preserve">ចុចប្រអប់</w:t>
+      </w:r>
+      <w:r>
+        <w:t xml:space="preserve"> </w:t>
+      </w:r>
+      <w:r>
+        <w:rPr>
+          <w:bCs/>
+          <w:b/>
+        </w:rPr>
+        <w:t xml:space="preserve">ឈ្មោះតៃកុង</w:t>
+      </w:r>
+      <w:r>
+        <w:t xml:space="preserve"> </w:t>
+      </w:r>
+      <w:r>
+        <w:t xml:space="preserve">ហើយជ្រើសរើស</w:t>
+      </w:r>
+      <w:r>
+        <w:t xml:space="preserve"> </w:t>
+      </w:r>
+      <w:r>
+        <w:rPr>
+          <w:bCs/>
+          <w:b/>
+        </w:rPr>
+        <w:t xml:space="preserve">ឈ្មោះរបស់អ្នក</w:t>
+      </w:r>
+      <w:r>
+        <w:t xml:space="preserve">។</w:t>
+      </w:r>
+    </w:p>
+    <w:p>
+      <w:pPr>
+        <w:numPr>
+          <w:ilvl w:val="0"/>
+          <w:numId w:val="1019"/>
         </w:numPr>
         <w:pStyle w:val="Compact"/>
       </w:pPr>
@@ -2798,18 +2961,18 @@
           <wp:inline>
             <wp:extent cx="2159999" cy="4672799"/>
             <wp:effectExtent b="0" l="0" r="0" t="0"/>
-            <wp:docPr descr="" title="" id="85" name="Picture"/>
+            <wp:docPr descr="" title="" id="91" name="Picture"/>
             <a:graphic>
               <a:graphicData uri="http://schemas.openxmlformats.org/drawingml/2006/picture">
                 <pic:pic>
                   <pic:nvPicPr>
-                    <pic:cNvPr descr="up/f14-qr.png" id="86" name="Picture"/>
+                    <pic:cNvPr descr="up/f14-qr.png" id="92" name="Picture"/>
                     <pic:cNvPicPr>
                       <a:picLocks noChangeArrowheads="1" noChangeAspect="1"/>
                     </pic:cNvPicPr>
                   </pic:nvPicPr>
                   <pic:blipFill>
-                    <a:blip r:embed="rId84"/>
+                    <a:blip r:embed="rId90"/>
                     <a:stretch>
                       <a:fillRect/>
                     </a:stretch>
@@ -2868,8 +3031,8 @@
         <w:t xml:space="preserve">ស្ទីគ័រខូច ឬរកមិនឃើញ? ជ្រើសរើសផ្លាកលេខដោយដៃ (ជំហាន ២)។</w:t>
       </w:r>
     </w:p>
-    <w:bookmarkEnd w:id="87"/>
-    <w:bookmarkStart w:id="93" w:name="មលករចកសងរបសខញ"/>
+    <w:bookmarkEnd w:id="93"/>
+    <w:bookmarkStart w:id="99" w:name="មលករចកសងរបសខញ"/>
     <w:p>
       <w:pPr>
         <w:pStyle w:val="Heading1"/>
@@ -2911,18 +3074,18 @@
           <wp:inline>
             <wp:extent cx="2159999" cy="4672799"/>
             <wp:effectExtent b="0" l="0" r="0" t="0"/>
-            <wp:docPr descr="" title="" id="89" name="Picture"/>
+            <wp:docPr descr="" title="" id="95" name="Picture"/>
             <a:graphic>
               <a:graphicData uri="http://schemas.openxmlformats.org/drawingml/2006/picture">
                 <pic:pic>
                   <pic:nvPicPr>
-                    <pic:cNvPr descr="up/f16-mine-streak.png" id="90" name="Picture"/>
+                    <pic:cNvPr descr="up/f16-mine-streak.png" id="96" name="Picture"/>
                     <pic:cNvPicPr>
                       <a:picLocks noChangeArrowheads="1" noChangeAspect="1"/>
                     </pic:cNvPicPr>
                   </pic:nvPicPr>
                   <pic:blipFill>
-                    <a:blip r:embed="rId88"/>
+                    <a:blip r:embed="rId94"/>
                     <a:stretch>
                       <a:fillRect/>
                     </a:stretch>
@@ -2949,204 +3112,13 @@
         </w:drawing>
       </w:r>
     </w:p>
-    <w:bookmarkStart w:id="91" w:name="សថនភព"/>
+    <w:bookmarkStart w:id="97" w:name="សថនភព"/>
     <w:p>
       <w:pPr>
         <w:pStyle w:val="Heading2"/>
       </w:pPr>
       <w:r>
         <w:t xml:space="preserve">ស្ថានភាព</w:t>
-      </w:r>
-    </w:p>
-    <w:p>
-      <w:pPr>
-        <w:numPr>
-          <w:ilvl w:val="0"/>
-          <w:numId w:val="1019"/>
-        </w:numPr>
-        <w:pStyle w:val="Compact"/>
-      </w:pPr>
-      <w:r>
-        <w:rPr>
-          <w:bCs/>
-          <w:b/>
-        </w:rPr>
-        <w:t xml:space="preserve">រង់ចាំ</w:t>
-      </w:r>
-      <w:r>
-        <w:t xml:space="preserve"> </w:t>
-      </w:r>
-      <w:r>
-        <w:t xml:space="preserve">(ពណ៌លឿង) – អ្នកពិនិត្យមិនទាន់មើល។ អ្នក</w:t>
-      </w:r>
-      <w:r>
-        <w:t xml:space="preserve"> </w:t>
-      </w:r>
-      <w:r>
-        <w:rPr>
-          <w:bCs/>
-          <w:b/>
-        </w:rPr>
-        <w:t xml:space="preserve">អាចកែ</w:t>
-      </w:r>
-      <w:r>
-        <w:t xml:space="preserve"> </w:t>
-      </w:r>
-      <w:r>
-        <w:t xml:space="preserve">បាន៖ ចុច</w:t>
-      </w:r>
-      <w:r>
-        <w:t xml:space="preserve"> </w:t>
-      </w:r>
-      <w:r>
-        <w:rPr>
-          <w:bCs/>
-          <w:b/>
-        </w:rPr>
-        <w:t xml:space="preserve">✏️ កែប្រែ</w:t>
-      </w:r>
-      <w:r>
-        <w:t xml:space="preserve"> </w:t>
-      </w:r>
-      <w:r>
-        <w:t xml:space="preserve">កែរួចចុច</w:t>
-      </w:r>
-      <w:r>
-        <w:t xml:space="preserve"> </w:t>
-      </w:r>
-      <w:r>
-        <w:rPr>
-          <w:bCs/>
-          <w:b/>
-        </w:rPr>
-        <w:t xml:space="preserve">💾 រក្សាទុក</w:t>
-      </w:r>
-      <w:r>
-        <w:t xml:space="preserve">។</w:t>
-      </w:r>
-    </w:p>
-    <w:p>
-      <w:pPr>
-        <w:numPr>
-          <w:ilvl w:val="0"/>
-          <w:numId w:val="1019"/>
-        </w:numPr>
-        <w:pStyle w:val="Compact"/>
-      </w:pPr>
-      <w:r>
-        <w:rPr>
-          <w:bCs/>
-          <w:b/>
-        </w:rPr>
-        <w:t xml:space="preserve">✔ ត្រឹមត្រូវ</w:t>
-      </w:r>
-      <w:r>
-        <w:t xml:space="preserve"> </w:t>
-      </w:r>
-      <w:r>
-        <w:t xml:space="preserve">(ពណ៌បៃតង) – អ្នកពិនិត្យបានបញ្ជាក់ថាត្រឹមត្រូវ។</w:t>
-      </w:r>
-    </w:p>
-    <w:p>
-      <w:pPr>
-        <w:numPr>
-          <w:ilvl w:val="0"/>
-          <w:numId w:val="1019"/>
-        </w:numPr>
-        <w:pStyle w:val="Compact"/>
-      </w:pPr>
-      <w:r>
-        <w:rPr>
-          <w:bCs/>
-          <w:b/>
-        </w:rPr>
-        <w:t xml:space="preserve">✖ មិនត្រឹមត្រូវ</w:t>
-      </w:r>
-      <w:r>
-        <w:t xml:space="preserve"> </w:t>
-      </w:r>
-      <w:r>
-        <w:t xml:space="preserve">(ពណ៌ក្រហម) – មានបញ្ហា។ សូមសួរអ្នកពិនិត្យ។</w:t>
-      </w:r>
-    </w:p>
-    <w:p>
-      <w:pPr>
-        <w:numPr>
-          <w:ilvl w:val="0"/>
-          <w:numId w:val="1019"/>
-        </w:numPr>
-        <w:pStyle w:val="Compact"/>
-      </w:pPr>
-      <w:r>
-        <w:rPr>
-          <w:bCs/>
-          <w:b/>
-        </w:rPr>
-        <w:t xml:space="preserve">⏳ កំពុងបញ្ជូន</w:t>
-      </w:r>
-      <w:r>
-        <w:t xml:space="preserve"> </w:t>
-      </w:r>
-      <w:r>
-        <w:t xml:space="preserve">– នៅក្នុងទូរស័ព្ទ មិនទាន់ដល់ (មើលផ្នែកទី ៦)។</w:t>
-      </w:r>
-    </w:p>
-    <w:p>
-      <w:pPr>
-        <w:pStyle w:val="BlockText"/>
-      </w:pPr>
-      <w:r>
-        <w:t xml:space="preserve">ពេលអ្នកពិនិត្យបានមើលហើយ អ្នក</w:t>
-      </w:r>
-      <w:r>
-        <w:t xml:space="preserve"> </w:t>
-      </w:r>
-      <w:r>
-        <w:rPr>
-          <w:bCs/>
-          <w:b/>
-        </w:rPr>
-        <w:t xml:space="preserve">មិនអាចកែ</w:t>
-      </w:r>
-      <w:r>
-        <w:t xml:space="preserve"> </w:t>
-      </w:r>
-      <w:r>
-        <w:t xml:space="preserve">បានទៀតទេ។ បើខុស សូមប្រាប់អ្នកពិនិត្យ។</w:t>
-      </w:r>
-    </w:p>
-    <w:bookmarkEnd w:id="91"/>
-    <w:bookmarkStart w:id="92" w:name="ផកយ-នងផលក"/>
-    <w:p>
-      <w:pPr>
-        <w:pStyle w:val="Heading2"/>
-      </w:pPr>
-      <w:r>
-        <w:t xml:space="preserve">ផ្កាយ និងផ្លាក 🏅</w:t>
-      </w:r>
-    </w:p>
-    <w:p>
-      <w:pPr>
-        <w:pStyle w:val="FirstParagraph"/>
-      </w:pPr>
-      <w:r>
-        <w:t xml:space="preserve">រាល់ពេលដែលការចាក់សាំងរបស់អ្នក</w:t>
-      </w:r>
-      <w:r>
-        <w:t xml:space="preserve"> </w:t>
-      </w:r>
-      <w:r>
-        <w:rPr>
-          <w:bCs/>
-          <w:b/>
-        </w:rPr>
-        <w:t xml:space="preserve">ត្រឹមត្រូវ</w:t>
-      </w:r>
-      <w:r>
-        <w:t xml:space="preserve"> </w:t>
-      </w:r>
-      <w:r>
-        <w:t xml:space="preserve">ជាប់ៗគ្នា អ្នកទទួលបានពិន្ទុ⭐។</w:t>
       </w:r>
     </w:p>
     <w:p>
@@ -3158,23 +3130,62 @@
         <w:pStyle w:val="Compact"/>
       </w:pPr>
       <w:r>
-        <w:t xml:space="preserve">🥉</w:t>
-      </w:r>
-      <w:r>
-        <w:t xml:space="preserve"> </w:t>
-      </w:r>
-      <w:r>
-        <w:rPr>
-          <w:bCs/>
-          <w:b/>
-        </w:rPr>
-        <w:t xml:space="preserve">ផ្លាកសំរិទ្ធ</w:t>
-      </w:r>
-      <w:r>
-        <w:t xml:space="preserve"> </w:t>
-      </w:r>
-      <w:r>
-        <w:t xml:space="preserve">– ត្រឹមត្រូវ ៥ ដងជាប់គ្នា</w:t>
+        <w:rPr>
+          <w:bCs/>
+          <w:b/>
+        </w:rPr>
+        <w:t xml:space="preserve">រង់ចាំ</w:t>
+      </w:r>
+      <w:r>
+        <w:t xml:space="preserve"> </w:t>
+      </w:r>
+      <w:r>
+        <w:t xml:space="preserve">(ពណ៌លឿង) – អ្នកពិនិត្យមិនទាន់មើល។ អ្នក</w:t>
+      </w:r>
+      <w:r>
+        <w:t xml:space="preserve"> </w:t>
+      </w:r>
+      <w:r>
+        <w:rPr>
+          <w:bCs/>
+          <w:b/>
+        </w:rPr>
+        <w:t xml:space="preserve">អាចកែ</w:t>
+      </w:r>
+      <w:r>
+        <w:t xml:space="preserve"> </w:t>
+      </w:r>
+      <w:r>
+        <w:t xml:space="preserve">បាន៖ ចុច</w:t>
+      </w:r>
+      <w:r>
+        <w:t xml:space="preserve"> </w:t>
+      </w:r>
+      <w:r>
+        <w:rPr>
+          <w:bCs/>
+          <w:b/>
+        </w:rPr>
+        <w:t xml:space="preserve">✏️ កែប្រែ</w:t>
+      </w:r>
+      <w:r>
+        <w:t xml:space="preserve"> </w:t>
+      </w:r>
+      <w:r>
+        <w:t xml:space="preserve">កែរួចចុច</w:t>
+      </w:r>
+      <w:r>
+        <w:t xml:space="preserve"> </w:t>
+      </w:r>
+      <w:r>
+        <w:rPr>
+          <w:bCs/>
+          <w:b/>
+        </w:rPr>
+        <w:t xml:space="preserve">💾 រក្សាទុក</w:t>
+      </w:r>
+      <w:r>
+        <w:t xml:space="preserve">។</w:t>
       </w:r>
     </w:p>
     <w:p>
@@ -3186,23 +3197,17 @@
         <w:pStyle w:val="Compact"/>
       </w:pPr>
       <w:r>
-        <w:t xml:space="preserve">🥈</w:t>
-      </w:r>
-      <w:r>
-        <w:t xml:space="preserve"> </w:t>
-      </w:r>
-      <w:r>
-        <w:rPr>
-          <w:bCs/>
-          <w:b/>
-        </w:rPr>
-        <w:t xml:space="preserve">ផ្លាកប្រាក់</w:t>
-      </w:r>
-      <w:r>
-        <w:t xml:space="preserve"> </w:t>
-      </w:r>
-      <w:r>
-        <w:t xml:space="preserve">– ត្រឹមត្រូវ ១០ ដងជាប់គ្នា</w:t>
+        <w:rPr>
+          <w:bCs/>
+          <w:b/>
+        </w:rPr>
+        <w:t xml:space="preserve">✔ ត្រឹមត្រូវ</w:t>
+      </w:r>
+      <w:r>
+        <w:t xml:space="preserve"> </w:t>
+      </w:r>
+      <w:r>
+        <w:t xml:space="preserve">(ពណ៌បៃតង) – អ្នកពិនិត្យបានបញ្ជាក់ថាត្រឹមត្រូវ។</w:t>
       </w:r>
     </w:p>
     <w:p>
@@ -3214,23 +3219,73 @@
         <w:pStyle w:val="Compact"/>
       </w:pPr>
       <w:r>
-        <w:t xml:space="preserve">🥇</w:t>
-      </w:r>
-      <w:r>
-        <w:t xml:space="preserve"> </w:t>
-      </w:r>
-      <w:r>
-        <w:rPr>
-          <w:bCs/>
-          <w:b/>
-        </w:rPr>
-        <w:t xml:space="preserve">ផ្លាកមាស</w:t>
-      </w:r>
-      <w:r>
-        <w:t xml:space="preserve"> </w:t>
-      </w:r>
-      <w:r>
-        <w:t xml:space="preserve">– ត្រឹមត្រូវ ១៥ ដងជាប់គ្នា</w:t>
+        <w:rPr>
+          <w:bCs/>
+          <w:b/>
+        </w:rPr>
+        <w:t xml:space="preserve">✖ មិនត្រឹមត្រូវ</w:t>
+      </w:r>
+      <w:r>
+        <w:t xml:space="preserve"> </w:t>
+      </w:r>
+      <w:r>
+        <w:t xml:space="preserve">(ពណ៌ក្រហម) – មានបញ្ហា។ សូមសួរអ្នកពិនិត្យ។</w:t>
+      </w:r>
+    </w:p>
+    <w:p>
+      <w:pPr>
+        <w:numPr>
+          <w:ilvl w:val="0"/>
+          <w:numId w:val="1020"/>
+        </w:numPr>
+        <w:pStyle w:val="Compact"/>
+      </w:pPr>
+      <w:r>
+        <w:rPr>
+          <w:bCs/>
+          <w:b/>
+        </w:rPr>
+        <w:t xml:space="preserve">⏳ កំពុងបញ្ជូន</w:t>
+      </w:r>
+      <w:r>
+        <w:t xml:space="preserve"> </w:t>
+      </w:r>
+      <w:r>
+        <w:t xml:space="preserve">– នៅក្នុងទូរស័ព្ទ មិនទាន់ដល់ (មើលផ្នែកទី ៦)។</w:t>
+      </w:r>
+    </w:p>
+    <w:p>
+      <w:pPr>
+        <w:pStyle w:val="BlockText"/>
+      </w:pPr>
+      <w:r>
+        <w:t xml:space="preserve">ពេលអ្នកពិនិត្យបានមើលហើយ អ្នក</w:t>
+      </w:r>
+      <w:r>
+        <w:t xml:space="preserve"> </w:t>
+      </w:r>
+      <w:r>
+        <w:rPr>
+          <w:bCs/>
+          <w:b/>
+        </w:rPr>
+        <w:t xml:space="preserve">មិនអាចកែ</w:t>
+      </w:r>
+      <w:r>
+        <w:t xml:space="preserve"> </w:t>
+      </w:r>
+      <w:r>
+        <w:t xml:space="preserve">បានទៀតទេ។ បើខុស សូមប្រាប់អ្នកពិនិត្យ។</w:t>
+      </w:r>
+    </w:p>
+    <w:bookmarkEnd w:id="97"/>
+    <w:bookmarkStart w:id="98" w:name="ផកយ-នងផលក"/>
+    <w:p>
+      <w:pPr>
+        <w:pStyle w:val="Heading2"/>
+      </w:pPr>
+      <w:r>
+        <w:t xml:space="preserve">ផ្កាយ និងផ្លាក 🏅</w:t>
       </w:r>
     </w:p>
     <w:p>
@@ -3238,52 +3293,23 @@
         <w:pStyle w:val="FirstParagraph"/>
       </w:pPr>
       <w:r>
-        <w:t xml:space="preserve">បើមួយ</w:t>
-      </w:r>
-      <w:r>
-        <w:t xml:space="preserve"> </w:t>
-      </w:r>
-      <w:r>
-        <w:rPr>
-          <w:bCs/>
-          <w:b/>
-        </w:rPr>
-        <w:t xml:space="preserve">មិនត្រឹមត្រូវ</w:t>
-      </w:r>
-      <w:r>
-        <w:t xml:space="preserve"> </w:t>
-      </w:r>
-      <w:r>
-        <w:t xml:space="preserve">ត្រូវចាប់ផ្តើមរាប់ពីថ្មី។ ថតរូបច្បាស់ វាយលេខត្រូវ នោះអ្នកនឹងទទួលបានផ្លាកមាស!</w:t>
-      </w:r>
-    </w:p>
-    <w:bookmarkEnd w:id="92"/>
-    <w:bookmarkEnd w:id="93"/>
-    <w:bookmarkStart w:id="94" w:name="ពលអនធណតខសយ-ឬគមន"/>
-    <w:p>
-      <w:pPr>
-        <w:pStyle w:val="Heading1"/>
-      </w:pPr>
-      <w:r>
-        <w:t xml:space="preserve">៦. ពេលអ៊ីនធឺណិតខ្សោយ ឬគ្មាន</w:t>
-      </w:r>
-    </w:p>
-    <w:p>
-      <w:pPr>
-        <w:pStyle w:val="FirstParagraph"/>
-      </w:pPr>
-      <w:r>
-        <w:rPr>
-          <w:bCs/>
-          <w:b/>
-        </w:rPr>
-        <w:t xml:space="preserve">កុំបារម្ភ។</w:t>
-      </w:r>
-      <w:r>
-        <w:t xml:space="preserve"> </w:t>
-      </w:r>
-      <w:r>
-        <w:t xml:space="preserve">អ្នកនៅតែបញ្ចូលបាន។</w:t>
+        <w:t xml:space="preserve">រាល់ពេលដែលការចាក់សាំងរបស់អ្នក</w:t>
+      </w:r>
+      <w:r>
+        <w:t xml:space="preserve"> </w:t>
+      </w:r>
+      <w:r>
+        <w:rPr>
+          <w:bCs/>
+          <w:b/>
+        </w:rPr>
+        <w:t xml:space="preserve">ត្រឹមត្រូវ</w:t>
+      </w:r>
+      <w:r>
+        <w:t xml:space="preserve"> </w:t>
+      </w:r>
+      <w:r>
+        <w:t xml:space="preserve">ជាប់ៗគ្នា អ្នកទទួលបានពិន្ទុ⭐។</w:t>
       </w:r>
     </w:p>
     <w:p>
@@ -3295,20 +3321,23 @@
         <w:pStyle w:val="Compact"/>
       </w:pPr>
       <w:r>
-        <w:t xml:space="preserve">បំពេញដូចធម្មតា ហើយចុច</w:t>
-      </w:r>
-      <w:r>
-        <w:t xml:space="preserve"> </w:t>
-      </w:r>
-      <w:r>
-        <w:rPr>
-          <w:bCs/>
-          <w:b/>
-        </w:rPr>
-        <w:t xml:space="preserve">✔️ បញ្ជូន</w:t>
-      </w:r>
-      <w:r>
-        <w:t xml:space="preserve">។</w:t>
+        <w:t xml:space="preserve">🥉</w:t>
+      </w:r>
+      <w:r>
+        <w:t xml:space="preserve"> </w:t>
+      </w:r>
+      <w:r>
+        <w:rPr>
+          <w:bCs/>
+          <w:b/>
+        </w:rPr>
+        <w:t xml:space="preserve">ផ្លាកសំរិទ្ធ</w:t>
+      </w:r>
+      <w:r>
+        <w:t xml:space="preserve"> </w:t>
+      </w:r>
+      <w:r>
+        <w:t xml:space="preserve">– ត្រឹមត្រូវ ៥ ដងជាប់គ្នា</w:t>
       </w:r>
     </w:p>
     <w:p>
@@ -3320,20 +3349,23 @@
         <w:pStyle w:val="Compact"/>
       </w:pPr>
       <w:r>
-        <w:t xml:space="preserve">បើគ្មានអ៊ីនធឺណិត អេក្រង់បង្ហាញ</w:t>
-      </w:r>
-      <w:r>
-        <w:t xml:space="preserve"> </w:t>
-      </w:r>
-      <w:r>
-        <w:rPr>
-          <w:bCs/>
-          <w:b/>
-        </w:rPr>
-        <w:t xml:space="preserve">បានរក្សាទុកក្នុងទូរស័ព្ទ</w:t>
-      </w:r>
-      <w:r>
-        <w:t xml:space="preserve">។ ទិន្នន័យនៅក្នុងទូរស័ព្ទរបស់អ្នក។</w:t>
+        <w:t xml:space="preserve">🥈</w:t>
+      </w:r>
+      <w:r>
+        <w:t xml:space="preserve"> </w:t>
+      </w:r>
+      <w:r>
+        <w:rPr>
+          <w:bCs/>
+          <w:b/>
+        </w:rPr>
+        <w:t xml:space="preserve">ផ្លាកប្រាក់</w:t>
+      </w:r>
+      <w:r>
+        <w:t xml:space="preserve"> </w:t>
+      </w:r>
+      <w:r>
+        <w:t xml:space="preserve">– ត្រឹមត្រូវ ១០ ដងជាប់គ្នា</w:t>
       </w:r>
     </w:p>
     <w:p>
@@ -3345,45 +3377,23 @@
         <w:pStyle w:val="Compact"/>
       </w:pPr>
       <w:r>
-        <w:t xml:space="preserve">នៅខាងលើទំព័របញ្ចូលថ្មី អ្នកឃើញ</w:t>
-      </w:r>
-      <w:r>
-        <w:t xml:space="preserve"> </w:t>
-      </w:r>
-      <w:r>
-        <w:rPr>
-          <w:bCs/>
-          <w:b/>
-        </w:rPr>
-        <w:t xml:space="preserve">⏳ កំពុងបញ្ជូន</w:t>
-      </w:r>
-      <w:r>
-        <w:t xml:space="preserve">។</w:t>
-      </w:r>
-    </w:p>
-    <w:p>
-      <w:pPr>
-        <w:numPr>
-          <w:ilvl w:val="0"/>
-          <w:numId w:val="1021"/>
-        </w:numPr>
-        <w:pStyle w:val="Compact"/>
-      </w:pPr>
-      <w:r>
-        <w:t xml:space="preserve">ពេលមានអ៊ីនធឺណិតវិញ វានឹង</w:t>
-      </w:r>
-      <w:r>
-        <w:t xml:space="preserve"> </w:t>
-      </w:r>
-      <w:r>
-        <w:rPr>
-          <w:bCs/>
-          <w:b/>
-        </w:rPr>
-        <w:t xml:space="preserve">បញ្ជូនដោយខ្លួនឯង</w:t>
-      </w:r>
-      <w:r>
-        <w:t xml:space="preserve">។ អ្នកមិនបាច់ធ្វើអ្វីទេ។</w:t>
+        <w:t xml:space="preserve">🥇</w:t>
+      </w:r>
+      <w:r>
+        <w:t xml:space="preserve"> </w:t>
+      </w:r>
+      <w:r>
+        <w:rPr>
+          <w:bCs/>
+          <w:b/>
+        </w:rPr>
+        <w:t xml:space="preserve">ផ្លាកមាស</w:t>
+      </w:r>
+      <w:r>
+        <w:t xml:space="preserve"> </w:t>
+      </w:r>
+      <w:r>
+        <w:t xml:space="preserve">– ត្រឹមត្រូវ ១៥ ដងជាប់គ្នា</w:t>
       </w:r>
     </w:p>
     <w:p>
@@ -3391,11 +3401,52 @@
         <w:pStyle w:val="FirstParagraph"/>
       </w:pPr>
       <w:r>
-        <w:rPr>
-          <w:bCs/>
-          <w:b/>
-        </w:rPr>
-        <w:t xml:space="preserve">ចំណាំ៖</w:t>
+        <w:t xml:space="preserve">បើមួយ</w:t>
+      </w:r>
+      <w:r>
+        <w:t xml:space="preserve"> </w:t>
+      </w:r>
+      <w:r>
+        <w:rPr>
+          <w:bCs/>
+          <w:b/>
+        </w:rPr>
+        <w:t xml:space="preserve">មិនត្រឹមត្រូវ</w:t>
+      </w:r>
+      <w:r>
+        <w:t xml:space="preserve"> </w:t>
+      </w:r>
+      <w:r>
+        <w:t xml:space="preserve">ត្រូវចាប់ផ្តើមរាប់ពីថ្មី។ ថតរូបច្បាស់ វាយលេខត្រូវ នោះអ្នកនឹងទទួលបានផ្លាកមាស!</w:t>
+      </w:r>
+    </w:p>
+    <w:bookmarkEnd w:id="98"/>
+    <w:bookmarkEnd w:id="99"/>
+    <w:bookmarkStart w:id="100" w:name="ពលអនធណតខសយ-ឬគមន"/>
+    <w:p>
+      <w:pPr>
+        <w:pStyle w:val="Heading1"/>
+      </w:pPr>
+      <w:r>
+        <w:t xml:space="preserve">៦. ពេលអ៊ីនធឺណិតខ្សោយ ឬគ្មាន</w:t>
+      </w:r>
+    </w:p>
+    <w:p>
+      <w:pPr>
+        <w:pStyle w:val="FirstParagraph"/>
+      </w:pPr>
+      <w:r>
+        <w:rPr>
+          <w:bCs/>
+          <w:b/>
+        </w:rPr>
+        <w:t xml:space="preserve">កុំបារម្ភ។</w:t>
+      </w:r>
+      <w:r>
+        <w:t xml:space="preserve"> </w:t>
+      </w:r>
+      <w:r>
+        <w:t xml:space="preserve">អ្នកនៅតែបញ្ចូលបាន។</w:t>
       </w:r>
     </w:p>
     <w:p>
@@ -3407,33 +3458,20 @@
         <w:pStyle w:val="Compact"/>
       </w:pPr>
       <w:r>
-        <w:rPr>
-          <w:bCs/>
-          <w:b/>
-        </w:rPr>
-        <w:t xml:space="preserve">កុំ</w:t>
-      </w:r>
-      <w:r>
-        <w:t xml:space="preserve"> </w:t>
-      </w:r>
-      <w:r>
-        <w:t xml:space="preserve">ចុច ចាកចេញ (Sign out) ហើយ</w:t>
-      </w:r>
-      <w:r>
-        <w:t xml:space="preserve"> </w:t>
-      </w:r>
-      <w:r>
-        <w:rPr>
-          <w:bCs/>
-          <w:b/>
-        </w:rPr>
-        <w:t xml:space="preserve">កុំ</w:t>
-      </w:r>
-      <w:r>
-        <w:t xml:space="preserve"> </w:t>
-      </w:r>
-      <w:r>
-        <w:t xml:space="preserve">លុបកម្មវិធី ឬលុបទិន្នន័យ Chrome មុនពេលបញ្ជូនរួច។</w:t>
+        <w:t xml:space="preserve">បំពេញដូចធម្មតា ហើយចុច</w:t>
+      </w:r>
+      <w:r>
+        <w:t xml:space="preserve"> </w:t>
+      </w:r>
+      <w:r>
+        <w:rPr>
+          <w:bCs/>
+          <w:b/>
+        </w:rPr>
+        <w:t xml:space="preserve">✔️ បញ្ជូន</w:t>
+      </w:r>
+      <w:r>
+        <w:t xml:space="preserve">។</w:t>
       </w:r>
     </w:p>
     <w:p>
@@ -3445,17 +3483,20 @@
         <w:pStyle w:val="Compact"/>
       </w:pPr>
       <w:r>
-        <w:rPr>
-          <w:bCs/>
-          <w:b/>
-        </w:rPr>
-        <w:t xml:space="preserve">កុំ</w:t>
-      </w:r>
-      <w:r>
-        <w:t xml:space="preserve"> </w:t>
-      </w:r>
-      <w:r>
-        <w:t xml:space="preserve">បញ្ចូលម្តងទៀតសម្រាប់ការចាក់សាំងដដែល។ ទុកឲ្យវាបញ្ជូនខ្លួនឯង។</w:t>
+        <w:t xml:space="preserve">បើគ្មានអ៊ីនធឺណិត អេក្រង់បង្ហាញ</w:t>
+      </w:r>
+      <w:r>
+        <w:t xml:space="preserve"> </w:t>
+      </w:r>
+      <w:r>
+        <w:rPr>
+          <w:bCs/>
+          <w:b/>
+        </w:rPr>
+        <w:t xml:space="preserve">បានរក្សាទុកក្នុងទូរស័ព្ទ</w:t>
+      </w:r>
+      <w:r>
+        <w:t xml:space="preserve">។ ទិន្នន័យនៅក្នុងទូរស័ព្ទរបស់អ្នក។</w:t>
       </w:r>
     </w:p>
     <w:p>
@@ -3467,6 +3508,128 @@
         <w:pStyle w:val="Compact"/>
       </w:pPr>
       <w:r>
+        <w:t xml:space="preserve">នៅខាងលើទំព័របញ្ចូលថ្មី អ្នកឃើញ</w:t>
+      </w:r>
+      <w:r>
+        <w:t xml:space="preserve"> </w:t>
+      </w:r>
+      <w:r>
+        <w:rPr>
+          <w:bCs/>
+          <w:b/>
+        </w:rPr>
+        <w:t xml:space="preserve">⏳ កំពុងបញ្ជូន</w:t>
+      </w:r>
+      <w:r>
+        <w:t xml:space="preserve">។</w:t>
+      </w:r>
+    </w:p>
+    <w:p>
+      <w:pPr>
+        <w:numPr>
+          <w:ilvl w:val="0"/>
+          <w:numId w:val="1022"/>
+        </w:numPr>
+        <w:pStyle w:val="Compact"/>
+      </w:pPr>
+      <w:r>
+        <w:t xml:space="preserve">ពេលមានអ៊ីនធឺណិតវិញ វានឹង</w:t>
+      </w:r>
+      <w:r>
+        <w:t xml:space="preserve"> </w:t>
+      </w:r>
+      <w:r>
+        <w:rPr>
+          <w:bCs/>
+          <w:b/>
+        </w:rPr>
+        <w:t xml:space="preserve">បញ្ជូនដោយខ្លួនឯង</w:t>
+      </w:r>
+      <w:r>
+        <w:t xml:space="preserve">។ អ្នកមិនបាច់ធ្វើអ្វីទេ។</w:t>
+      </w:r>
+    </w:p>
+    <w:p>
+      <w:pPr>
+        <w:pStyle w:val="FirstParagraph"/>
+      </w:pPr>
+      <w:r>
+        <w:rPr>
+          <w:bCs/>
+          <w:b/>
+        </w:rPr>
+        <w:t xml:space="preserve">ចំណាំ៖</w:t>
+      </w:r>
+    </w:p>
+    <w:p>
+      <w:pPr>
+        <w:numPr>
+          <w:ilvl w:val="0"/>
+          <w:numId w:val="1023"/>
+        </w:numPr>
+        <w:pStyle w:val="Compact"/>
+      </w:pPr>
+      <w:r>
+        <w:rPr>
+          <w:bCs/>
+          <w:b/>
+        </w:rPr>
+        <w:t xml:space="preserve">កុំ</w:t>
+      </w:r>
+      <w:r>
+        <w:t xml:space="preserve"> </w:t>
+      </w:r>
+      <w:r>
+        <w:t xml:space="preserve">ចុច ចាកចេញ (Sign out) ហើយ</w:t>
+      </w:r>
+      <w:r>
+        <w:t xml:space="preserve"> </w:t>
+      </w:r>
+      <w:r>
+        <w:rPr>
+          <w:bCs/>
+          <w:b/>
+        </w:rPr>
+        <w:t xml:space="preserve">កុំ</w:t>
+      </w:r>
+      <w:r>
+        <w:t xml:space="preserve"> </w:t>
+      </w:r>
+      <w:r>
+        <w:t xml:space="preserve">លុបកម្មវិធី ឬលុបទិន្នន័យ Chrome មុនពេលបញ្ជូនរួច។</w:t>
+      </w:r>
+    </w:p>
+    <w:p>
+      <w:pPr>
+        <w:numPr>
+          <w:ilvl w:val="0"/>
+          <w:numId w:val="1023"/>
+        </w:numPr>
+        <w:pStyle w:val="Compact"/>
+      </w:pPr>
+      <w:r>
+        <w:rPr>
+          <w:bCs/>
+          <w:b/>
+        </w:rPr>
+        <w:t xml:space="preserve">កុំ</w:t>
+      </w:r>
+      <w:r>
+        <w:t xml:space="preserve"> </w:t>
+      </w:r>
+      <w:r>
+        <w:t xml:space="preserve">បញ្ចូលម្តងទៀតសម្រាប់ការចាក់សាំងដដែល។ ទុកឲ្យវាបញ្ជូនខ្លួនឯង។</w:t>
+      </w:r>
+    </w:p>
+    <w:p>
+      <w:pPr>
+        <w:numPr>
+          <w:ilvl w:val="0"/>
+          <w:numId w:val="1023"/>
+        </w:numPr>
+        <w:pStyle w:val="Compact"/>
+      </w:pPr>
+      <w:r>
         <w:t xml:space="preserve">បើឃើញ</w:t>
       </w:r>
       <w:r>
@@ -3539,8 +3702,8 @@
         <w:t xml:space="preserve">នៅខាងលើឆ្វេង ដើម្បីទាញថ្មី។</w:t>
       </w:r>
     </w:p>
-    <w:bookmarkEnd w:id="94"/>
-    <w:bookmarkStart w:id="95" w:name="បញហញកញប-នងដណសរយ"/>
+    <w:bookmarkEnd w:id="100"/>
+    <w:bookmarkStart w:id="101" w:name="បញហញកញប-នងដណសរយ"/>
     <w:p>
       <w:pPr>
         <w:pStyle w:val="Heading1"/>
@@ -4129,8 +4292,8 @@
         </w:tc>
       </w:tr>
     </w:tbl>
-    <w:bookmarkEnd w:id="95"/>
-    <w:bookmarkStart w:id="97" w:name="ចបបសខនៗ"/>
+    <w:bookmarkEnd w:id="101"/>
+    <w:bookmarkStart w:id="103" w:name="ចបបសខនៗ"/>
     <w:p>
       <w:pPr>
         <w:pStyle w:val="Heading1"/>
@@ -4143,7 +4306,7 @@
       <w:pPr>
         <w:numPr>
           <w:ilvl w:val="0"/>
-          <w:numId w:val="1023"/>
+          <w:numId w:val="1024"/>
         </w:numPr>
         <w:pStyle w:val="Compact"/>
       </w:pPr>
@@ -4165,7 +4328,7 @@
       <w:pPr>
         <w:numPr>
           <w:ilvl w:val="0"/>
-          <w:numId w:val="1023"/>
+          <w:numId w:val="1024"/>
         </w:numPr>
         <w:pStyle w:val="Compact"/>
       </w:pPr>
@@ -4190,7 +4353,7 @@
       <w:pPr>
         <w:numPr>
           <w:ilvl w:val="0"/>
-          <w:numId w:val="1023"/>
+          <w:numId w:val="1024"/>
         </w:numPr>
         <w:pStyle w:val="Compact"/>
       </w:pPr>
@@ -4218,7 +4381,7 @@
       <w:pPr>
         <w:numPr>
           <w:ilvl w:val="0"/>
-          <w:numId w:val="1023"/>
+          <w:numId w:val="1024"/>
         </w:numPr>
         <w:pStyle w:val="Compact"/>
       </w:pPr>
@@ -4256,7 +4419,7 @@
       <w:pPr>
         <w:numPr>
           <w:ilvl w:val="0"/>
-          <w:numId w:val="1023"/>
+          <w:numId w:val="1024"/>
         </w:numPr>
         <w:pStyle w:val="Compact"/>
       </w:pPr>
@@ -4284,7 +4447,7 @@
       <w:pPr>
         <w:numPr>
           <w:ilvl w:val="0"/>
-          <w:numId w:val="1023"/>
+          <w:numId w:val="1024"/>
         </w:numPr>
         <w:pStyle w:val="Compact"/>
       </w:pPr>
@@ -4309,7 +4472,7 @@
       <w:pPr>
         <w:numPr>
           <w:ilvl w:val="0"/>
-          <w:numId w:val="1023"/>
+          <w:numId w:val="1024"/>
         </w:numPr>
         <w:pStyle w:val="Compact"/>
       </w:pPr>
@@ -4337,7 +4500,7 @@
       <w:pPr>
         <w:numPr>
           <w:ilvl w:val="0"/>
-          <w:numId w:val="1023"/>
+          <w:numId w:val="1024"/>
         </w:numPr>
         <w:pStyle w:val="Compact"/>
       </w:pPr>
@@ -4374,7 +4537,7 @@
         <w:t xml:space="preserve">។ បើមិនអាចកែបាន ប្រាប់អ្នកពិនិត្យ។</w:t>
       </w:r>
     </w:p>
-    <w:bookmarkStart w:id="96" w:name="តរវករជនយ"/>
+    <w:bookmarkStart w:id="102" w:name="តរវករជនយ"/>
     <w:p>
       <w:pPr>
         <w:pStyle w:val="Heading2"/>
@@ -4401,8 +4564,8 @@
         <w:t xml:space="preserve">[ឈ្មោះ] – [លេខទូរស័ព្ទ]</w:t>
       </w:r>
     </w:p>
-    <w:bookmarkEnd w:id="96"/>
-    <w:bookmarkEnd w:id="97"/>
+    <w:bookmarkEnd w:id="102"/>
+    <w:bookmarkEnd w:id="103"/>
     <w:sectPr/>
   </w:body>
 </w:document>
@@ -4755,6 +4918,91 @@
       </w:pPr>
     </w:lvl>
   </w:abstractNum>
+  <w:abstractNum w:abstractNumId="99415">
+    <w:nsid w:val="A99415"/>
+    <w:multiLevelType w:val="multilevel"/>
+    <w:lvl w:ilvl="0">
+      <w:start w:val="5"/>
+      <w:numFmt w:val="decimal"/>
+      <w:lvlText w:val="%1."/>
+      <w:lvlJc w:val="left"/>
+      <w:pPr>
+        <w:ind w:left="720" w:hanging="480"/>
+      </w:pPr>
+    </w:lvl>
+    <w:lvl w:ilvl="1">
+      <w:start w:val="5"/>
+      <w:numFmt w:val="decimal"/>
+      <w:lvlText w:val="%2."/>
+      <w:lvlJc w:val="left"/>
+      <w:pPr>
+        <w:ind w:left="1440" w:hanging="480"/>
+      </w:pPr>
+    </w:lvl>
+    <w:lvl w:ilvl="2">
+      <w:start w:val="5"/>
+      <w:numFmt w:val="decimal"/>
+      <w:lvlText w:val="%3."/>
+      <w:lvlJc w:val="left"/>
+      <w:pPr>
+        <w:ind w:left="2160" w:hanging="480"/>
+      </w:pPr>
+    </w:lvl>
+    <w:lvl w:ilvl="3">
+      <w:start w:val="5"/>
+      <w:numFmt w:val="decimal"/>
+      <w:lvlText w:val="%4."/>
+      <w:lvlJc w:val="left"/>
+      <w:pPr>
+        <w:ind w:left="2880" w:hanging="480"/>
+      </w:pPr>
+    </w:lvl>
+    <w:lvl w:ilvl="4">
+      <w:start w:val="5"/>
+      <w:numFmt w:val="decimal"/>
+      <w:lvlText w:val="%5."/>
+      <w:lvlJc w:val="left"/>
+      <w:pPr>
+        <w:ind w:left="3600" w:hanging="480"/>
+      </w:pPr>
+    </w:lvl>
+    <w:lvl w:ilvl="5">
+      <w:start w:val="5"/>
+      <w:numFmt w:val="decimal"/>
+      <w:lvlText w:val="%6."/>
+      <w:lvlJc w:val="left"/>
+      <w:pPr>
+        <w:ind w:left="4320" w:hanging="480"/>
+      </w:pPr>
+    </w:lvl>
+    <w:lvl w:ilvl="6">
+      <w:start w:val="5"/>
+      <w:numFmt w:val="decimal"/>
+      <w:lvlText w:val="%7."/>
+      <w:lvlJc w:val="left"/>
+      <w:pPr>
+        <w:ind w:left="5040" w:hanging="480"/>
+      </w:pPr>
+    </w:lvl>
+    <w:lvl w:ilvl="7">
+      <w:start w:val="5"/>
+      <w:numFmt w:val="decimal"/>
+      <w:lvlText w:val="%8."/>
+      <w:lvlJc w:val="left"/>
+      <w:pPr>
+        <w:ind w:left="5760" w:hanging="480"/>
+      </w:pPr>
+    </w:lvl>
+    <w:lvl w:ilvl="8">
+      <w:start w:val="5"/>
+      <w:numFmt w:val="decimal"/>
+      <w:lvlText w:val="%9."/>
+      <w:lvlJc w:val="left"/>
+      <w:pPr>
+        <w:ind w:left="6480" w:hanging="480"/>
+      </w:pPr>
+    </w:lvl>
+  </w:abstractNum>
   <w:abstractNum w:abstractNumId="99413">
     <w:nsid w:val="A99413"/>
     <w:multiLevelType w:val="multilevel"/>
@@ -5148,6 +5396,36 @@
     </w:lvlOverride>
   </w:num>
   <w:num w:numId="1011">
+    <w:abstractNumId w:val="99415"/>
+    <w:lvlOverride w:ilvl="0">
+      <w:startOverride w:val="5"/>
+    </w:lvlOverride>
+    <w:lvlOverride w:ilvl="1">
+      <w:startOverride w:val="5"/>
+    </w:lvlOverride>
+    <w:lvlOverride w:ilvl="2">
+      <w:startOverride w:val="5"/>
+    </w:lvlOverride>
+    <w:lvlOverride w:ilvl="3">
+      <w:startOverride w:val="5"/>
+    </w:lvlOverride>
+    <w:lvlOverride w:ilvl="4">
+      <w:startOverride w:val="5"/>
+    </w:lvlOverride>
+    <w:lvlOverride w:ilvl="5">
+      <w:startOverride w:val="5"/>
+    </w:lvlOverride>
+    <w:lvlOverride w:ilvl="6">
+      <w:startOverride w:val="5"/>
+    </w:lvlOverride>
+    <w:lvlOverride w:ilvl="7">
+      <w:startOverride w:val="5"/>
+    </w:lvlOverride>
+    <w:lvlOverride w:ilvl="8">
+      <w:startOverride w:val="5"/>
+    </w:lvlOverride>
+  </w:num>
+  <w:num w:numId="1012">
     <w:abstractNumId w:val="99411"/>
     <w:lvlOverride w:ilvl="0">
       <w:startOverride w:val="1"/>
@@ -5177,7 +5455,7 @@
       <w:startOverride w:val="1"/>
     </w:lvlOverride>
   </w:num>
-  <w:num w:numId="1012">
+  <w:num w:numId="1013">
     <w:abstractNumId w:val="99413"/>
     <w:lvlOverride w:ilvl="0">
       <w:startOverride w:val="3"/>
@@ -5207,7 +5485,7 @@
       <w:startOverride w:val="3"/>
     </w:lvlOverride>
   </w:num>
-  <w:num w:numId="1013">
+  <w:num w:numId="1014">
     <w:abstractNumId w:val="99411"/>
     <w:lvlOverride w:ilvl="0">
       <w:startOverride w:val="1"/>
@@ -5237,10 +5515,10 @@
       <w:startOverride w:val="1"/>
     </w:lvlOverride>
   </w:num>
-  <w:num w:numId="1014">
+  <w:num w:numId="1015">
     <w:abstractNumId w:val="991"/>
   </w:num>
-  <w:num w:numId="1015">
+  <w:num w:numId="1016">
     <w:abstractNumId w:val="99411"/>
     <w:lvlOverride w:ilvl="0">
       <w:startOverride w:val="1"/>
@@ -5270,7 +5548,7 @@
       <w:startOverride w:val="1"/>
     </w:lvlOverride>
   </w:num>
-  <w:num w:numId="1016">
+  <w:num w:numId="1017">
     <w:abstractNumId w:val="99412"/>
     <w:lvlOverride w:ilvl="0">
       <w:startOverride w:val="2"/>
@@ -5300,10 +5578,10 @@
       <w:startOverride w:val="2"/>
     </w:lvlOverride>
   </w:num>
-  <w:num w:numId="1017">
+  <w:num w:numId="1018">
     <w:abstractNumId w:val="991"/>
   </w:num>
-  <w:num w:numId="1018">
+  <w:num w:numId="1019">
     <w:abstractNumId w:val="99411"/>
     <w:lvlOverride w:ilvl="0">
       <w:startOverride w:val="1"/>
@@ -5332,14 +5610,14 @@
     <w:lvlOverride w:ilvl="8">
       <w:startOverride w:val="1"/>
     </w:lvlOverride>
-  </w:num>
-  <w:num w:numId="1019">
-    <w:abstractNumId w:val="991"/>
   </w:num>
   <w:num w:numId="1020">
     <w:abstractNumId w:val="991"/>
   </w:num>
   <w:num w:numId="1021">
+    <w:abstractNumId w:val="991"/>
+  </w:num>
+  <w:num w:numId="1022">
     <w:abstractNumId w:val="99411"/>
     <w:lvlOverride w:ilvl="0">
       <w:startOverride w:val="1"/>
@@ -5369,10 +5647,10 @@
       <w:startOverride w:val="1"/>
     </w:lvlOverride>
   </w:num>
-  <w:num w:numId="1022">
+  <w:num w:numId="1023">
     <w:abstractNumId w:val="991"/>
   </w:num>
-  <w:num w:numId="1023">
+  <w:num w:numId="1024">
     <w:abstractNumId w:val="99411"/>
     <w:lvlOverride w:ilvl="0">
       <w:startOverride w:val="1"/>

</xml_diff>